<commit_message>
Update dashboard and story documents
</commit_message>
<xml_diff>
--- a/Documents/4.Dashboard/Dashboard Design.docx
+++ b/Documents/4.Dashboard/Dashboard Design.docx
@@ -302,9 +302,11 @@
               <w:spacing w:after="0" w:line="240" w:lineRule="auto"/>
               <w:ind w:left="125"/>
             </w:pPr>
+            <w:proofErr w:type="gramStart"/>
             <w:r>
               <w:t>5  Marks</w:t>
             </w:r>
+            <w:proofErr w:type="gramEnd"/>
           </w:p>
         </w:tc>
       </w:tr>
@@ -1034,6 +1036,7 @@
       <w:r>
         <w:rPr>
           <w:rFonts w:ascii="Arial" w:eastAsia="Arial" w:hAnsi="Arial" w:cs="Arial"/>
+          <w:noProof/>
           <w:sz w:val="20"/>
           <w:szCs w:val="20"/>
         </w:rPr>
@@ -1374,7 +1377,17 @@
             <w:sz w:val="28"/>
             <w:szCs w:val="28"/>
           </w:rPr>
-          <w:t>https://public.tableau.com/app/profile/vishal.bade6689/viz/WorkBook_17870655561870/Dashboard1?publish=yes</w:t>
+          <w:t>Public</w:t>
+        </w:r>
+      </w:hyperlink>
+      <w:hyperlink r:id="rId9" w:history="1">
+        <w:r>
+          <w:rPr>
+            <w:rStyle w:val="Hyperlink"/>
+            <w:sz w:val="28"/>
+            <w:szCs w:val="28"/>
+          </w:rPr>
+          <w:t>https://public.tableau.com/app/profile/vrushali.dhure/viz/story_17878464641870/Dashboard1?publish=yes</w:t>
         </w:r>
       </w:hyperlink>
     </w:p>

</xml_diff>